<commit_message>
fix(sla): align the three fill-in values to the SLA value column
Co-Authored-By: Claude Fable 5 <noreply@anthropic.com>
</commit_message>
<xml_diff>
--- a/src/templates/isp_sla.docx
+++ b/src/templates/isp_sla.docx
@@ -155,7 +155,7 @@
                 <w:sz w:val="18"/>
                 <w:szCs w:val="18"/>
               </w:rPr>
-              <w:t xml:space="preserve">Effective Date: {Effective Date}</w:t>
+              <w:t xml:space="preserve">Effective Date:                                                 {Effective Date}</w:t>
             </w:r>
           </w:p>
           <w:p>
@@ -174,7 +174,7 @@
                 <w:sz w:val="18"/>
                 <w:szCs w:val="18"/>
               </w:rPr>
-              <w:t xml:space="preserve">Customer Name: {Customer Name}</w:t>
+              <w:t xml:space="preserve">Customer Name:                                                  {Customer Name}</w:t>
             </w:r>
           </w:p>
           <w:p>
@@ -193,7 +193,7 @@
                 <w:sz w:val="18"/>
                 <w:szCs w:val="18"/>
               </w:rPr>
-              <w:t xml:space="preserve">CAF No     : {CAF No}</w:t>
+              <w:t xml:space="preserve">CAF No     :                                                    {CAF No}</w:t>
             </w:r>
           </w:p>
           <w:p>

</xml_diff>

<commit_message>
fix(sla): tab-stop alignment for the three fill-in fields (matches the SLA value column)
Co-Authored-By: Claude Fable 5 <noreply@anthropic.com>
</commit_message>
<xml_diff>
--- a/src/templates/isp_sla.docx
+++ b/src/templates/isp_sla.docx
@@ -143,6 +143,9 @@
             <w:pPr>
               <w:pStyle w:val="Normal"/>
               <w:snapToGrid w:val="false"/>
+              <w:tabs>
+                <w:tab w:val="left" w:pos="3780"/>
+              </w:tabs>
               <w:rPr>
                 <w:color w:val="000000"/>
                 <w:sz w:val="18"/>
@@ -155,13 +158,25 @@
                 <w:sz w:val="18"/>
                 <w:szCs w:val="18"/>
               </w:rPr>
-              <w:t xml:space="preserve">Effective Date:                                                 {Effective Date}</w:t>
+              <w:t xml:space="preserve">Effective Date:</w:t>
+            </w:r>
+            <w:r>
+              <w:rPr>
+                <w:color w:val="000000"/>
+                <w:sz w:val="18"/>
+                <w:szCs w:val="18"/>
+              </w:rPr>
+              <w:tab/>
+              <w:t xml:space="preserve">{Effective Date}</w:t>
             </w:r>
           </w:p>
           <w:p>
             <w:pPr>
               <w:pStyle w:val="Normal"/>
               <w:snapToGrid w:val="false"/>
+              <w:tabs>
+                <w:tab w:val="left" w:pos="3780"/>
+              </w:tabs>
               <w:rPr>
                 <w:color w:val="000000"/>
                 <w:sz w:val="18"/>
@@ -174,13 +189,25 @@
                 <w:sz w:val="18"/>
                 <w:szCs w:val="18"/>
               </w:rPr>
-              <w:t xml:space="preserve">Customer Name:                                                  {Customer Name}</w:t>
+              <w:t xml:space="preserve">Customer Name:</w:t>
+            </w:r>
+            <w:r>
+              <w:rPr>
+                <w:color w:val="000000"/>
+                <w:sz w:val="18"/>
+                <w:szCs w:val="18"/>
+              </w:rPr>
+              <w:tab/>
+              <w:t xml:space="preserve">{Customer Name}</w:t>
             </w:r>
           </w:p>
           <w:p>
             <w:pPr>
               <w:pStyle w:val="Normal"/>
               <w:snapToGrid w:val="false"/>
+              <w:tabs>
+                <w:tab w:val="left" w:pos="3780"/>
+              </w:tabs>
               <w:rPr>
                 <w:color w:val="000000"/>
                 <w:sz w:val="18"/>
@@ -193,7 +220,16 @@
                 <w:sz w:val="18"/>
                 <w:szCs w:val="18"/>
               </w:rPr>
-              <w:t xml:space="preserve">CAF No     :                                                    {CAF No}</w:t>
+              <w:t xml:space="preserve">CAF No     :</w:t>
+            </w:r>
+            <w:r>
+              <w:rPr>
+                <w:color w:val="000000"/>
+                <w:sz w:val="18"/>
+                <w:szCs w:val="18"/>
+              </w:rPr>
+              <w:tab/>
+              <w:t xml:space="preserve">{CAF No}</w:t>
             </w:r>
           </w:p>
           <w:p>

</xml_diff>